<commit_message>
docs: update ai usage log and weekly status report
</commit_message>
<xml_diff>
--- a/docs/management/weekly/W03-status.docx
+++ b/docs/management/weekly/W03-status.docx
@@ -775,7 +775,7 @@
     </w:p>
     <w:sdt>
       <w:sdtPr>
-        <w:id w:val="2027283648"/>
+        <w:id w:val="720835100"/>
         <w:docPartObj>
           <w:docPartGallery w:val="Table of Contents"/>
           <w:docPartUnique w:val="1"/>
@@ -1472,7 +1472,7 @@
             </w:pPr>
             <w:sdt>
               <w:sdtPr>
-                <w:id w:val="1677298715"/>
+                <w:id w:val="-377814760"/>
                 <w:tag w:val="goog_rdk_0"/>
               </w:sdtPr>
               <w:sdtContent>
@@ -1900,7 +1900,7 @@
             </w:pPr>
             <w:sdt>
               <w:sdtPr>
-                <w:id w:val="546609722"/>
+                <w:id w:val="406499847"/>
                 <w:tag w:val="goog_rdk_1"/>
               </w:sdtPr>
               <w:sdtContent>
@@ -2138,7 +2138,7 @@
             </w:pPr>
             <w:sdt>
               <w:sdtPr>
-                <w:id w:val="-367464735"/>
+                <w:id w:val="554498243"/>
                 <w:tag w:val="goog_rdk_2"/>
               </w:sdtPr>
               <w:sdtContent>
@@ -3620,7 +3620,7 @@
             </w:pPr>
             <w:sdt>
               <w:sdtPr>
-                <w:id w:val="281650351"/>
+                <w:id w:val="1305327310"/>
                 <w:tag w:val="goog_rdk_3"/>
               </w:sdtPr>
               <w:sdtContent>
@@ -3829,7 +3829,7 @@
             </w:pPr>
             <w:sdt>
               <w:sdtPr>
-                <w:id w:val="770312345"/>
+                <w:id w:val="1198871318"/>
                 <w:tag w:val="goog_rdk_4"/>
               </w:sdtPr>
               <w:sdtContent>
@@ -4043,7 +4043,7 @@
             </w:pPr>
             <w:sdt>
               <w:sdtPr>
-                <w:id w:val="-965382081"/>
+                <w:id w:val="1963252064"/>
                 <w:tag w:val="goog_rdk_5"/>
               </w:sdtPr>
               <w:sdtContent>
@@ -4867,7 +4867,7 @@
             </w:pPr>
             <w:sdt>
               <w:sdtPr>
-                <w:id w:val="-276090633"/>
+                <w:id w:val="-2037149347"/>
                 <w:tag w:val="goog_rdk_6"/>
               </w:sdtPr>
               <w:sdtContent>
@@ -5081,7 +5081,7 @@
             </w:pPr>
             <w:sdt>
               <w:sdtPr>
-                <w:id w:val="1828570313"/>
+                <w:id w:val="1998308808"/>
                 <w:tag w:val="goog_rdk_7"/>
               </w:sdtPr>
               <w:sdtContent>
@@ -5482,7 +5482,7 @@
             </w:pPr>
             <w:sdt>
               <w:sdtPr>
-                <w:id w:val="-389358068"/>
+                <w:id w:val="1611654342"/>
                 <w:tag w:val="goog_rdk_8"/>
               </w:sdtPr>
               <w:sdtContent>
@@ -5618,7 +5618,7 @@
             </w:pPr>
             <w:sdt>
               <w:sdtPr>
-                <w:id w:val="930663570"/>
+                <w:id w:val="-1077116140"/>
                 <w:tag w:val="goog_rdk_9"/>
               </w:sdtPr>
               <w:sdtContent>
@@ -5755,7 +5755,7 @@
             </w:pPr>
             <w:sdt>
               <w:sdtPr>
-                <w:id w:val="-1433580536"/>
+                <w:id w:val="420440059"/>
                 <w:tag w:val="goog_rdk_10"/>
               </w:sdtPr>
               <w:sdtContent>
@@ -5891,7 +5891,7 @@
             </w:pPr>
             <w:sdt>
               <w:sdtPr>
-                <w:id w:val="-1017874928"/>
+                <w:id w:val="-1039800010"/>
                 <w:tag w:val="goog_rdk_11"/>
               </w:sdtPr>
               <w:sdtContent>
@@ -6028,7 +6028,7 @@
             </w:pPr>
             <w:sdt>
               <w:sdtPr>
-                <w:id w:val="1692566705"/>
+                <w:id w:val="320790429"/>
                 <w:tag w:val="goog_rdk_12"/>
               </w:sdtPr>
               <w:sdtContent>
@@ -6165,7 +6165,7 @@
             </w:pPr>
             <w:sdt>
               <w:sdtPr>
-                <w:id w:val="-650703277"/>
+                <w:id w:val="1094559010"/>
                 <w:tag w:val="goog_rdk_13"/>
               </w:sdtPr>
               <w:sdtContent>
@@ -6748,7 +6748,7 @@
             </w:pPr>
             <w:sdt>
               <w:sdtPr>
-                <w:id w:val="-2002272598"/>
+                <w:id w:val="-192010454"/>
                 <w:tag w:val="goog_rdk_14"/>
               </w:sdtPr>
               <w:sdtContent>
@@ -6981,7 +6981,7 @@
             </w:pPr>
             <w:sdt>
               <w:sdtPr>
-                <w:id w:val="-1854986819"/>
+                <w:id w:val="-291596951"/>
                 <w:tag w:val="goog_rdk_15"/>
               </w:sdtPr>
               <w:sdtContent>
@@ -7214,7 +7214,7 @@
             </w:pPr>
             <w:sdt>
               <w:sdtPr>
-                <w:id w:val="1338657311"/>
+                <w:id w:val="1769252900"/>
                 <w:tag w:val="goog_rdk_16"/>
               </w:sdtPr>
               <w:sdtContent>
@@ -7425,7 +7425,7 @@
             </w:pPr>
             <w:sdt>
               <w:sdtPr>
-                <w:id w:val="-1743385088"/>
+                <w:id w:val="-1776518907"/>
                 <w:tag w:val="goog_rdk_17"/>
               </w:sdtPr>
               <w:sdtContent>
@@ -7636,7 +7636,7 @@
             </w:pPr>
             <w:sdt>
               <w:sdtPr>
-                <w:id w:val="938572426"/>
+                <w:id w:val="-147224680"/>
                 <w:tag w:val="goog_rdk_18"/>
               </w:sdtPr>
               <w:sdtContent>
@@ -8072,7 +8072,7 @@
               <w:rPr>
                 <w:rtl w:val="0"/>
               </w:rPr>
-              <w:t xml:space="preserve">15</w:t>
+              <w:t xml:space="preserve">16</w:t>
             </w:r>
           </w:p>
         </w:tc>
@@ -8088,7 +8088,7 @@
               <w:rPr>
                 <w:rtl w:val="0"/>
               </w:rPr>
-              <w:t xml:space="preserve">18</w:t>
+              <w:t xml:space="preserve">19</w:t>
             </w:r>
           </w:p>
         </w:tc>

</xml_diff>